<commit_message>
Drop the recording link from both reports
The brief presents recording the discussion as one suggested way of
documenting it, not a requirement, and the rubric scores no points for it.
The team decided against recording, so the reports no longer carry a
placeholder row for a link that will never exist.

- Remove the "Enlace de la grabación" row from both minutes tables
- Change the modality row from "Videoconferencia sincrónica con grabación"
  to "Videoconferencia sincrónica"
- Cite Keyton & Beck as 2023 in the Module 1 report, matching how the course
  itself cites the book and the Module 2 report
- Align the README with the team roster spelling used in the reports

Both reports remain 6 pages and keep every section within the 200-500 word
range the brief asks for.

Co-Authored-By: Claude Opus 5 <noreply@anthropic.com>
</commit_message>
<xml_diff>
--- a/Modulo 1/Sumativa 2/PMG531_M1_Res_Grupo_03.docx
+++ b/Modulo 1/Sumativa 2/PMG531_M1_Res_Grupo_03.docx
@@ -498,7 +498,7 @@
                 <w:i w:val="0"/>
                 <w:sz w:val="20"/>
               </w:rPr>
-              <w:t>Videoconferencia sincrónica con grabación</w:t>
+              <w:t>Videoconferencia sincrónica</w:t>
             </w:r>
           </w:p>
         </w:tc>
@@ -632,50 +632,6 @@
           </w:p>
         </w:tc>
       </w:tr>
-      <w:tr>
-        <w:tc>
-          <w:tcPr>
-            <w:tcW w:type="dxa" w:w="2608"/>
-            <w:shd w:val="clear" w:fill="F2F4F8"/>
-          </w:tcPr>
-          <w:p>
-            <w:pPr>
-              <w:spacing w:line="240" w:lineRule="auto" w:before="40" w:after="40"/>
-              <w:jc w:val="left"/>
-            </w:pPr>
-            <w:r>
-              <w:rPr>
-                <w:rFonts w:ascii="Calibri" w:hAnsi="Calibri" w:eastAsia="Calibri"/>
-                <w:b/>
-                <w:i w:val="0"/>
-                <w:sz w:val="20"/>
-              </w:rPr>
-              <w:t>Enlace de la grabación</w:t>
-            </w:r>
-          </w:p>
-        </w:tc>
-        <w:tc>
-          <w:tcPr>
-            <w:tcW w:type="dxa" w:w="6746"/>
-          </w:tcPr>
-          <w:p>
-            <w:pPr>
-              <w:spacing w:line="240" w:lineRule="auto" w:before="40" w:after="40"/>
-              <w:jc w:val="left"/>
-            </w:pPr>
-            <w:r>
-              <w:rPr>
-                <w:rFonts w:ascii="Calibri" w:hAnsi="Calibri" w:eastAsia="Calibri"/>
-                <w:b/>
-                <w:i w:val="0"/>
-                <w:color w:val="C00000"/>
-                <w:sz w:val="20"/>
-              </w:rPr>
-              <w:t>[Insertar aquí el enlace de la grabación]</w:t>
-            </w:r>
-          </w:p>
-        </w:tc>
-      </w:tr>
     </w:tbl>
     <w:p>
       <w:pPr>
@@ -726,7 +682,7 @@
           <w:i w:val="0"/>
           <w:sz w:val="22"/>
         </w:rPr>
-        <w:t xml:space="preserve">Los constructos que organizaron la conversación provienen del capítulo 8, “Leading Groups”, de Keyton y Beck (2022). El primero es el </w:t>
+        <w:t xml:space="preserve">Los constructos que organizaron la conversación provienen del capítulo 8, “Leading Groups”, de Keyton y Beck (2023). El primero es el </w:t>
       </w:r>
       <w:r>
         <w:rPr>
@@ -1001,7 +957,7 @@
           <w:i w:val="0"/>
           <w:sz w:val="22"/>
         </w:rPr>
-        <w:t>Keyton y Beck (2022), capítulo 8: “Leading Groups”.</w:t>
+        <w:t>Keyton y Beck (2023), capítulo 8: “Leading Groups”.</w:t>
       </w:r>
       <w:r>
         <w:rPr>
@@ -1333,7 +1289,7 @@
           <w:color w:val="1F3150"/>
           <w:sz w:val="23"/>
         </w:rPr>
-        <w:t>5.2. Las competencias de liderazgo (Keyton y Beck, 2022)</w:t>
+        <w:t>5.2. Las competencias de liderazgo (Keyton y Beck, 2023)</w:t>
       </w:r>
     </w:p>
     <w:p>
@@ -1775,7 +1731,7 @@
           <w:i w:val="0"/>
           <w:sz w:val="22"/>
         </w:rPr>
-        <w:t xml:space="preserve">Keyton, J., &amp; Beck, S. J. (2022). </w:t>
+        <w:t xml:space="preserve">Keyton, J., &amp; Beck, S. J. (2023). </w:t>
       </w:r>
       <w:r>
         <w:rPr>

</xml_diff>